<commit_message>
Round 6b: fix cover-letter/manuscript data-availability inconsistency, shorten cover letter to one page
- Cover letter previously claimed data/code were 'publicly available',
  contradicting the manuscript's 'will be added before final submission'.
  Rewrote to match the manuscript exactly (future tense, same wording).
- Cut the detailed p-value/Holm-Bonferroni/TOST walkthrough down to one
  summary sentence; letter now renders as a clean single page (was
  bleeding a signature-only second page).
- Added a ready-to-upload Zenodo package
  (vllm-arabic-rag-v1.0-submission.zip, 4.5MB, 111 files, secret-scanned)
  and documented a direct-Zenodo-upload fast path in RELEASE_STEPS.md as
  an alternative to the GitHub-release-then-Zenodo flow.
- Neither document was changed to past tense -- the release still requires
  the author's own GitHub/Zenodo action; see RELEASE_STEPS.md.
</commit_message>
<xml_diff>
--- a/paper/cover_letter.docx
+++ b/paper/cover_letter.docx
@@ -10,6 +10,8 @@
         <w:rPr>
           <w:b/>
           <w:bCs/>
+          <w:sz w:val="22"/>
+          <w:szCs w:val="22"/>
         </w:rPr>
         <w:t xml:space="preserve">Akram Taha</w:t>
       </w:r>
@@ -19,6 +21,10 @@
         <w:spacing w:after="0"/>
       </w:pPr>
       <w:r>
+        <w:rPr>
+          <w:sz w:val="20"/>
+          <w:szCs w:val="20"/>
+        </w:rPr>
         <w:t xml:space="preserve">College of Computer Engineering, University of Technology - Iraq, Baghdad, Iraq</w:t>
       </w:r>
     </w:p>
@@ -27,101 +33,136 @@
         <w:spacing w:after="0"/>
       </w:pPr>
       <w:r>
+        <w:rPr>
+          <w:sz w:val="20"/>
+          <w:szCs w:val="20"/>
+        </w:rPr>
         <w:t xml:space="preserve">Center for Artificial Intelligence Technology (CAIT), FTSM, Universiti Kebangsaan Malaysia (UKM), Bangi, Selangor, Malaysia</w:t>
       </w:r>
     </w:p>
     <w:p>
       <w:pPr>
-        <w:spacing w:after="400"/>
-      </w:pPr>
-      <w:r>
+        <w:spacing w:after="240"/>
+      </w:pPr>
+      <w:r>
+        <w:rPr>
+          <w:sz w:val="20"/>
+          <w:szCs w:val="20"/>
+        </w:rPr>
         <w:t xml:space="preserve">Email: akramtaha30@gmail.com  |  ORCID: 0009-0002-4020-8060</w:t>
       </w:r>
     </w:p>
     <w:p>
       <w:pPr>
-        <w:spacing w:after="400"/>
-      </w:pPr>
-      <w:r>
+        <w:spacing w:after="240"/>
+      </w:pPr>
+      <w:r>
+        <w:rPr>
+          <w:sz w:val="20"/>
+          <w:szCs w:val="20"/>
+        </w:rPr>
         <w:t xml:space="preserve">August 6, 2026</w:t>
       </w:r>
     </w:p>
     <w:p>
       <w:pPr>
-        <w:spacing w:after="200"/>
-      </w:pPr>
-      <w:r>
+        <w:spacing w:after="160"/>
+      </w:pPr>
+      <w:r>
+        <w:rPr>
+          <w:sz w:val="22"/>
+          <w:szCs w:val="22"/>
+        </w:rPr>
         <w:t xml:space="preserve">Dear Editor-in-Chief,</w:t>
       </w:r>
     </w:p>
     <w:p>
       <w:pPr>
-        <w:spacing w:after="200"/>
+        <w:spacing w:after="160"/>
         <w:jc w:val="left"/>
       </w:pPr>
       <w:r>
-        <w:t xml:space="preserve">I am submitting the manuscript “Semantic-Driven Context Pruning for Arabic RAG Systems: Toward Memory-Efficient vLLM-Based Deployment” for consideration as a research article in Applied Intelligence. The manuscript has one author (myself) and has not been published, and is not under consideration, elsewhere.</w:t>
-      </w:r>
-    </w:p>
-    <w:p>
-      <w:pPr>
-        <w:spacing w:after="200"/>
+        <w:rPr>
+          <w:sz w:val="22"/>
+          <w:szCs w:val="22"/>
+        </w:rPr>
+        <w:t xml:space="preserve">I am submitting the manuscript “Semantic-Driven Context Pruning for Arabic RAG Systems: Toward Memory-Efficient vLLM-Based Deployment” for consideration as a research article in Applied Intelligence. The manuscript has one author (myself), has not been published, and is not under consideration elsewhere.</w:t>
+      </w:r>
+    </w:p>
+    <w:p>
+      <w:pPr>
+        <w:spacing w:after="160"/>
         <w:jc w:val="left"/>
       </w:pPr>
       <w:r>
-        <w:t xml:space="preserve">The paper addresses a memory bottleneck specific to Arabic Retrieval-Augmented Generation (RAG) deployments: Arabic's morphological richness causes subword tokenizers to fragment text far more aggressively than equivalent English text, inflating the Key-Value (KV) cache that memory-efficient serving engines such as vLLM must maintain per request. I introduce a Lightweight Semantic Pruning Middleware (LSPM) that scores retrieved passages at the sentence level with a cross-encoder and forwards only the highest-relevance subset before generation, and I report a set of preliminary, honestly-scoped experiments rather than a single headline claim.</w:t>
-      </w:r>
-    </w:p>
-    <w:p>
-      <w:pPr>
-        <w:spacing w:after="200"/>
+        <w:rPr>
+          <w:sz w:val="22"/>
+          <w:szCs w:val="22"/>
+        </w:rPr>
+        <w:t xml:space="preserve">The paper addresses a memory bottleneck specific to Arabic Retrieval-Augmented Generation (RAG): Arabic's morphological richness inflates token counts relative to English, increasing the Key-Value cache that memory-efficient serving engines such as vLLM must maintain per request. I introduce a Lightweight Semantic Pruning Middleware (LSPM) that prunes retrieved passages at the sentence level with a cross-encoder before generation. In a properly powered re-test on 140 real questions from the Arabic Reading Comprehension Dataset (980 live model generations), LSPM significantly outperforms naive length-matched truncation at the most aggressive compression ratio tested and is statistically equivalent to the unpruned answer, a result I report honestly alongside the ratios where the comparison remains open rather than as a uniform claim.</w:t>
+      </w:r>
+    </w:p>
+    <w:p>
+      <w:pPr>
+        <w:spacing w:after="160"/>
         <w:jc w:val="left"/>
       </w:pPr>
       <w:r>
-        <w:t xml:space="preserve">Two results are, I believe, of particular interest to your readership. First, across two independently trained tokenizers on a hand-verified parallel corpus, I confirm the Arabic-English tokenization disparity with statistical significance (aggregate ratio 1.69x-1.76x, bootstrap p &lt; 0.0001). Second, and central to the paper's contribution, a paired baseline comparison against naive length-matched truncation — re-tested on 140 real questions from the Arabic Reading Comprehension Dataset (ARCD) against ground-truth answers, 980 live model generations in total — finds that LSPM's cross-encoder scoring significantly outperforms naive truncation head-to-head at the most aggressive compression ratio tested (Holm-Bonferroni-adjusted p = 0.005), while remaining statistically equivalent to the unpruned answer by a predefined-margin equivalence test. I report this result alongside the ratios and settings where the comparison remains open, including a smaller, complementary check under real (non-guaranteed) retrieval, rather than rounding the evidence up to a uniform claim.</w:t>
-      </w:r>
-    </w:p>
-    <w:p>
-      <w:pPr>
-        <w:spacing w:after="200"/>
+        <w:rPr>
+          <w:sz w:val="22"/>
+          <w:szCs w:val="22"/>
+        </w:rPr>
+        <w:t xml:space="preserve">The manuscript is explicit about its scope: it is an architecture-and-preliminary-validation study. No GPU or vLLM server was available for this work, so I report an analytical, clearly labeled projection of KV-cache savings rather than a measured throughput result, and I specify the benchmark protocol a follow-up study would need to measure it directly. vLLM is the paper's intended deployment target, not an evaluated one.</w:t>
+      </w:r>
+    </w:p>
+    <w:p>
+      <w:pPr>
+        <w:spacing w:after="160"/>
         <w:jc w:val="left"/>
       </w:pPr>
       <w:r>
-        <w:t xml:space="preserve">The manuscript is explicit about its scope: it is an architecture-and-preliminary-validation study, not a systems benchmark paper. No GPU was available for this submission, so I report an analytical, clearly labeled projection of KV-cache savings rather than a measured throughput number, and I specify in full the GPU benchmark protocol needed to measure it directly in follow-up work. I believe this transparency, together with the statistically rigorous (Holm-Bonferroni-corrected, TOST-equivalence-tested) treatment of the core comparison, makes the paper a genuine and honest contribution appropriate for Applied Intelligence's scope at the intersection of applied machine learning systems and natural language processing.</w:t>
-      </w:r>
-    </w:p>
-    <w:p>
-      <w:pPr>
-        <w:spacing w:after="200"/>
+        <w:rPr>
+          <w:sz w:val="22"/>
+          <w:szCs w:val="22"/>
+        </w:rPr>
+        <w:t xml:space="preserve">The complete implementation, raw experimental data, and analysis code will be made publicly available at https://github.com/Akramtaha98/vllm-arabic-rag, with a tagged release and a Zenodo-archived DOI, before final submission, to support independent reproduction of every reported result.</w:t>
+      </w:r>
+    </w:p>
+    <w:p>
+      <w:pPr>
+        <w:spacing w:after="160"/>
         <w:jc w:val="left"/>
       </w:pPr>
       <w:r>
-        <w:t xml:space="preserve">The complete implementation, all raw experimental data, and a live demonstration interface are publicly available at https://github.com/Akramtaha98/vllm-arabic-rag to support independent reproduction of every reported result, including the null and inconclusive findings.</w:t>
-      </w:r>
-    </w:p>
-    <w:p>
-      <w:pPr>
-        <w:spacing w:after="200"/>
+        <w:rPr>
+          <w:sz w:val="22"/>
+          <w:szCs w:val="22"/>
+        </w:rPr>
+        <w:t xml:space="preserve">This work involved no human participants or personal data, and I have no conflicts of interest to disclose. Large language model assistance was used for implementation, literature verification, and drafting under my direction; this is disclosed in full in the manuscript, and I take full responsibility for the accuracy of all claims and results reported.</w:t>
+      </w:r>
+    </w:p>
+    <w:p>
+      <w:pPr>
+        <w:spacing w:after="160"/>
         <w:jc w:val="left"/>
       </w:pPr>
       <w:r>
-        <w:t xml:space="preserve">I confirm that this work involved no human participants, personal data, or clinical data, and that I have no conflicts of interest to disclose. Large language model assistance was used during this project for implementation, literature search assistance subsequently verified against primary sources, simulated methodological review, and drafting assistance under my direction and full review; this is disclosed in full in the manuscript's Statements and Declarations section, and I take full responsibility for the accuracy of all claims, citations, and results reported.</w:t>
-      </w:r>
-    </w:p>
-    <w:p>
-      <w:pPr>
-        <w:spacing w:after="200"/>
-        <w:jc w:val="left"/>
-      </w:pPr>
-      <w:r>
+        <w:rPr>
+          <w:sz w:val="22"/>
+          <w:szCs w:val="22"/>
+        </w:rPr>
         <w:t xml:space="preserve">Thank you for considering this manuscript. I would be pleased to suggest reviewers or provide any further information the editorial process requires.</w:t>
       </w:r>
     </w:p>
     <w:p>
       <w:pPr>
-        <w:spacing w:after="400"/>
-      </w:pPr>
-      <w:r>
+        <w:spacing w:after="240"/>
+      </w:pPr>
+      <w:r>
+        <w:rPr>
+          <w:sz w:val="22"/>
+          <w:szCs w:val="22"/>
+        </w:rPr>
         <w:t xml:space="preserve">Sincerely,</w:t>
       </w:r>
     </w:p>
@@ -130,12 +171,16 @@
         <w:spacing w:after="0"/>
       </w:pPr>
       <w:r>
+        <w:rPr>
+          <w:sz w:val="22"/>
+          <w:szCs w:val="22"/>
+        </w:rPr>
         <w:t xml:space="preserve">Akram Taha</w:t>
       </w:r>
     </w:p>
     <w:sectPr>
       <w:pgSz w:w="12240" w:h="15840" w:orient="portrait"/>
-      <w:pgMar w:top="1440" w:right="1440" w:bottom="1440" w:left="1440" w:header="708" w:footer="708" w:gutter="0"/>
+      <w:pgMar w:top="1080" w:right="1350" w:bottom="1080" w:left="1350" w:header="708" w:footer="708" w:gutter="0"/>
       <w:pgNumType/>
       <w:docGrid w:linePitch="360"/>
     </w:sectPr>

</xml_diff>

<commit_message>
Add Zenodo data citation [43], upgrade GPU benchmark harness, add human eval kit
</commit_message>
<xml_diff>
--- a/paper/cover_letter.docx
+++ b/paper/cover_letter.docx
@@ -61,7 +61,7 @@
           <w:sz w:val="20"/>
           <w:szCs w:val="20"/>
         </w:rPr>
-        <w:t xml:space="preserve">August 6, 2026</w:t>
+        <w:t xml:space="preserve">August 7, 2026</w:t>
       </w:r>
     </w:p>
     <w:p>
@@ -125,7 +125,7 @@
           <w:sz w:val="22"/>
           <w:szCs w:val="22"/>
         </w:rPr>
-        <w:t xml:space="preserve">The complete implementation, raw experimental data, and analysis code will be made publicly available at https://github.com/Akramtaha98/vllm-arabic-rag, with a tagged release and a Zenodo-archived DOI, before final submission, to support independent reproduction of every reported result.</w:t>
+        <w:t xml:space="preserve">The complete implementation, raw experimental data, and analysis code are publicly available at https://github.com/Akramtaha98/vllm-arabic-rag, tagged release v1.0-submission, archived with DOI 10.5281/zenodo.21826992 (https://doi.org/10.5281/zenodo.21826992), to support independent reproduction of every reported result.</w:t>
       </w:r>
     </w:p>
     <w:p>

</xml_diff>